<commit_message>
docs:Se agrega contenid a actividad 4, clase 9
</commit_message>
<xml_diff>
--- a/Ejercicios/Clase 9/Actividad3.docx
+++ b/Ejercicios/Clase 9/Actividad3.docx
@@ -287,6 +287,12 @@
           <w:lang w:eastAsia="es-CR"/>
         </w:rPr>
         <w:t xml:space="preserve">, a </w:t>
+      </w:r>
+      <w:r>
+        <w:rPr>
+          <w:lang w:eastAsia="es-CR"/>
+        </w:rPr>
+        <w:t xml:space="preserve"> </w:t>
       </w:r>
       <w:r>
         <w:rPr>

</xml_diff>